<commit_message>
Team 4: fix: preferred table width
</commit_message>
<xml_diff>
--- a/03_Team_Work/Team4/Milestone_3_Components/Ready/KU_M3_Team4_ProfileManagerEI_v05.docx
+++ b/03_Team_Work/Team4/Milestone_3_Components/Ready/KU_M3_Team4_ProfileManagerEI_v05.docx
@@ -437,7 +437,6 @@
                 <w:szCs w:val="22"/>
               </w:rPr>
             </w:pPr>
-            <w:proofErr w:type="spellStart"/>
             <w:r>
               <w:rPr>
                 <w:rFonts w:ascii="Arial" w:hAnsi="Arial" w:cs="Arial"/>
@@ -446,7 +445,6 @@
               </w:rPr>
               <w:t>StudentProfile</w:t>
             </w:r>
-            <w:proofErr w:type="spellEnd"/>
           </w:p>
         </w:tc>
         <w:tc>
@@ -549,35 +547,7 @@
                 <w:sz w:val="22"/>
                 <w:szCs w:val="22"/>
               </w:rPr>
-              <w:t xml:space="preserve">Accolades, </w:t>
-            </w:r>
-            <w:proofErr w:type="spellStart"/>
-            <w:proofErr w:type="gramStart"/>
-            <w:r>
-              <w:rPr>
-                <w:rFonts w:ascii="Arial" w:hAnsi="Arial" w:cs="Arial"/>
-                <w:sz w:val="22"/>
-                <w:szCs w:val="22"/>
-              </w:rPr>
-              <w:t>addAccolade</w:t>
-            </w:r>
-            <w:proofErr w:type="spellEnd"/>
-            <w:r>
-              <w:rPr>
-                <w:rFonts w:ascii="Arial" w:hAnsi="Arial" w:cs="Arial"/>
-                <w:sz w:val="22"/>
-                <w:szCs w:val="22"/>
-              </w:rPr>
-              <w:t>(</w:t>
-            </w:r>
-            <w:proofErr w:type="gramEnd"/>
-            <w:r>
-              <w:rPr>
-                <w:rFonts w:ascii="Arial" w:hAnsi="Arial" w:cs="Arial"/>
-                <w:sz w:val="22"/>
-                <w:szCs w:val="22"/>
-              </w:rPr>
-              <w:t>)</w:t>
+              <w:t>Accolades, addAccolade()</w:t>
             </w:r>
           </w:p>
         </w:tc>
@@ -736,7 +706,6 @@
                 <w:szCs w:val="22"/>
               </w:rPr>
             </w:pPr>
-            <w:proofErr w:type="spellStart"/>
             <w:r>
               <w:rPr>
                 <w:rFonts w:ascii="Arial" w:hAnsi="Arial" w:cs="Arial"/>
@@ -745,7 +714,6 @@
               </w:rPr>
               <w:t>StudentProfile</w:t>
             </w:r>
-            <w:proofErr w:type="spellEnd"/>
           </w:p>
         </w:tc>
       </w:tr>
@@ -794,33 +762,13 @@
                 <w:szCs w:val="22"/>
               </w:rPr>
             </w:pPr>
-            <w:proofErr w:type="spellStart"/>
-            <w:proofErr w:type="gramStart"/>
-            <w:r>
-              <w:rPr>
-                <w:rFonts w:ascii="Arial" w:hAnsi="Arial" w:cs="Arial"/>
-                <w:sz w:val="22"/>
-                <w:szCs w:val="22"/>
-              </w:rPr>
-              <w:t>addAccolade</w:t>
-            </w:r>
-            <w:proofErr w:type="spellEnd"/>
-            <w:r>
-              <w:rPr>
-                <w:rFonts w:ascii="Arial" w:hAnsi="Arial" w:cs="Arial"/>
-                <w:sz w:val="22"/>
-                <w:szCs w:val="22"/>
-              </w:rPr>
-              <w:t>(</w:t>
-            </w:r>
-            <w:proofErr w:type="gramEnd"/>
-            <w:r>
-              <w:rPr>
-                <w:rFonts w:ascii="Arial" w:hAnsi="Arial" w:cs="Arial"/>
-                <w:sz w:val="22"/>
-                <w:szCs w:val="22"/>
-              </w:rPr>
-              <w:t>)</w:t>
+            <w:r>
+              <w:rPr>
+                <w:rFonts w:ascii="Arial" w:hAnsi="Arial" w:cs="Arial"/>
+                <w:sz w:val="22"/>
+                <w:szCs w:val="22"/>
+              </w:rPr>
+              <w:t>addAccolade()</w:t>
             </w:r>
           </w:p>
         </w:tc>
@@ -923,7 +871,6 @@
                 <w:szCs w:val="22"/>
               </w:rPr>
             </w:pPr>
-            <w:proofErr w:type="spellStart"/>
             <w:r>
               <w:rPr>
                 <w:rFonts w:ascii="Arial" w:hAnsi="Arial" w:cs="Arial"/>
@@ -932,7 +879,6 @@
               </w:rPr>
               <w:t>StudentProfile</w:t>
             </w:r>
-            <w:proofErr w:type="spellEnd"/>
           </w:p>
         </w:tc>
       </w:tr>
@@ -981,33 +927,13 @@
                 <w:szCs w:val="22"/>
               </w:rPr>
             </w:pPr>
-            <w:proofErr w:type="spellStart"/>
-            <w:proofErr w:type="gramStart"/>
-            <w:r>
-              <w:rPr>
-                <w:rFonts w:ascii="Arial" w:hAnsi="Arial" w:cs="Arial"/>
-                <w:sz w:val="22"/>
-                <w:szCs w:val="22"/>
-              </w:rPr>
-              <w:t>updateAccolade</w:t>
-            </w:r>
-            <w:proofErr w:type="spellEnd"/>
-            <w:r>
-              <w:rPr>
-                <w:rFonts w:ascii="Arial" w:hAnsi="Arial" w:cs="Arial"/>
-                <w:sz w:val="22"/>
-                <w:szCs w:val="22"/>
-              </w:rPr>
-              <w:t>(</w:t>
-            </w:r>
-            <w:proofErr w:type="gramEnd"/>
-            <w:r>
-              <w:rPr>
-                <w:rFonts w:ascii="Arial" w:hAnsi="Arial" w:cs="Arial"/>
-                <w:sz w:val="22"/>
-                <w:szCs w:val="22"/>
-              </w:rPr>
-              <w:t>)</w:t>
+            <w:r>
+              <w:rPr>
+                <w:rFonts w:ascii="Arial" w:hAnsi="Arial" w:cs="Arial"/>
+                <w:sz w:val="22"/>
+                <w:szCs w:val="22"/>
+              </w:rPr>
+              <w:t>updateAccolade()</w:t>
             </w:r>
           </w:p>
         </w:tc>
@@ -1093,7 +1019,6 @@
                 <w:szCs w:val="22"/>
               </w:rPr>
             </w:pPr>
-            <w:proofErr w:type="spellStart"/>
             <w:r>
               <w:rPr>
                 <w:rFonts w:ascii="Arial" w:hAnsi="Arial" w:cs="Arial"/>
@@ -1102,7 +1027,6 @@
               </w:rPr>
               <w:t>StudentProfile</w:t>
             </w:r>
-            <w:proofErr w:type="spellEnd"/>
           </w:p>
         </w:tc>
       </w:tr>
@@ -1151,33 +1075,13 @@
                 <w:szCs w:val="22"/>
               </w:rPr>
             </w:pPr>
-            <w:proofErr w:type="spellStart"/>
-            <w:proofErr w:type="gramStart"/>
-            <w:r>
-              <w:rPr>
-                <w:rFonts w:ascii="Arial" w:hAnsi="Arial" w:cs="Arial"/>
-                <w:sz w:val="22"/>
-                <w:szCs w:val="22"/>
-              </w:rPr>
-              <w:t>deleteAccolade</w:t>
-            </w:r>
-            <w:proofErr w:type="spellEnd"/>
-            <w:r>
-              <w:rPr>
-                <w:rFonts w:ascii="Arial" w:hAnsi="Arial" w:cs="Arial"/>
-                <w:sz w:val="22"/>
-                <w:szCs w:val="22"/>
-              </w:rPr>
-              <w:t>(</w:t>
-            </w:r>
-            <w:proofErr w:type="gramEnd"/>
-            <w:r>
-              <w:rPr>
-                <w:rFonts w:ascii="Arial" w:hAnsi="Arial" w:cs="Arial"/>
-                <w:sz w:val="22"/>
-                <w:szCs w:val="22"/>
-              </w:rPr>
-              <w:t>)</w:t>
+            <w:r>
+              <w:rPr>
+                <w:rFonts w:ascii="Arial" w:hAnsi="Arial" w:cs="Arial"/>
+                <w:sz w:val="22"/>
+                <w:szCs w:val="22"/>
+              </w:rPr>
+              <w:t>deleteAccolade()</w:t>
             </w:r>
           </w:p>
         </w:tc>
@@ -1280,7 +1184,6 @@
                 <w:szCs w:val="22"/>
               </w:rPr>
             </w:pPr>
-            <w:proofErr w:type="spellStart"/>
             <w:r>
               <w:rPr>
                 <w:rFonts w:ascii="Arial" w:hAnsi="Arial" w:cs="Arial"/>
@@ -1289,7 +1192,6 @@
               </w:rPr>
               <w:t>StudentProfile</w:t>
             </w:r>
-            <w:proofErr w:type="spellEnd"/>
           </w:p>
         </w:tc>
       </w:tr>
@@ -1338,33 +1240,13 @@
                 <w:szCs w:val="22"/>
               </w:rPr>
             </w:pPr>
-            <w:proofErr w:type="spellStart"/>
-            <w:proofErr w:type="gramStart"/>
-            <w:r>
-              <w:rPr>
-                <w:rFonts w:ascii="Arial" w:hAnsi="Arial" w:cs="Arial"/>
-                <w:sz w:val="22"/>
-                <w:szCs w:val="22"/>
-              </w:rPr>
-              <w:t>updateProfileImageReference</w:t>
-            </w:r>
-            <w:proofErr w:type="spellEnd"/>
-            <w:r>
-              <w:rPr>
-                <w:rFonts w:ascii="Arial" w:hAnsi="Arial" w:cs="Arial"/>
-                <w:sz w:val="22"/>
-                <w:szCs w:val="22"/>
-              </w:rPr>
-              <w:t>(</w:t>
-            </w:r>
-            <w:proofErr w:type="gramEnd"/>
-            <w:r>
-              <w:rPr>
-                <w:rFonts w:ascii="Arial" w:hAnsi="Arial" w:cs="Arial"/>
-                <w:sz w:val="22"/>
-                <w:szCs w:val="22"/>
-              </w:rPr>
-              <w:t>)</w:t>
+            <w:r>
+              <w:rPr>
+                <w:rFonts w:ascii="Arial" w:hAnsi="Arial" w:cs="Arial"/>
+                <w:sz w:val="22"/>
+                <w:szCs w:val="22"/>
+              </w:rPr>
+              <w:t>updateProfileImageReference()</w:t>
             </w:r>
           </w:p>
         </w:tc>
@@ -1450,7 +1332,6 @@
                 <w:szCs w:val="22"/>
               </w:rPr>
             </w:pPr>
-            <w:proofErr w:type="spellStart"/>
             <w:r>
               <w:rPr>
                 <w:rFonts w:ascii="Arial" w:hAnsi="Arial" w:cs="Arial"/>
@@ -1459,7 +1340,6 @@
               </w:rPr>
               <w:t>StudentProfile</w:t>
             </w:r>
-            <w:proofErr w:type="spellEnd"/>
           </w:p>
         </w:tc>
       </w:tr>
@@ -1508,7 +1388,6 @@
                 <w:szCs w:val="22"/>
               </w:rPr>
             </w:pPr>
-            <w:proofErr w:type="spellStart"/>
             <w:r>
               <w:rPr>
                 <w:rFonts w:ascii="Arial" w:hAnsi="Arial" w:cs="Arial"/>
@@ -1517,7 +1396,6 @@
               </w:rPr>
               <w:t>ContactInformation</w:t>
             </w:r>
-            <w:proofErr w:type="spellEnd"/>
           </w:p>
         </w:tc>
         <w:tc>
@@ -1602,7 +1480,6 @@
                 <w:szCs w:val="22"/>
               </w:rPr>
             </w:pPr>
-            <w:proofErr w:type="spellStart"/>
             <w:r>
               <w:rPr>
                 <w:rFonts w:ascii="Arial" w:hAnsi="Arial" w:cs="Arial"/>
@@ -1611,7 +1488,6 @@
               </w:rPr>
               <w:t>StudentProfile</w:t>
             </w:r>
-            <w:proofErr w:type="spellEnd"/>
           </w:p>
         </w:tc>
       </w:tr>
@@ -1659,7 +1535,6 @@
                 <w:szCs w:val="22"/>
               </w:rPr>
             </w:pPr>
-            <w:proofErr w:type="spellStart"/>
             <w:r>
               <w:rPr>
                 <w:rFonts w:ascii="Arial" w:hAnsi="Arial" w:cs="Arial"/>
@@ -1668,7 +1543,6 @@
               </w:rPr>
               <w:t>EducationInformation</w:t>
             </w:r>
-            <w:proofErr w:type="spellEnd"/>
           </w:p>
         </w:tc>
         <w:tc>
@@ -1749,7 +1623,6 @@
                 <w:szCs w:val="22"/>
               </w:rPr>
             </w:pPr>
-            <w:proofErr w:type="spellStart"/>
             <w:r>
               <w:rPr>
                 <w:rFonts w:ascii="Arial" w:hAnsi="Arial" w:cs="Arial"/>
@@ -1758,7 +1631,6 @@
               </w:rPr>
               <w:t>StudentProfile</w:t>
             </w:r>
-            <w:proofErr w:type="spellEnd"/>
           </w:p>
         </w:tc>
       </w:tr>
@@ -1899,7 +1771,6 @@
                 <w:szCs w:val="22"/>
               </w:rPr>
             </w:pPr>
-            <w:proofErr w:type="spellStart"/>
             <w:r>
               <w:rPr>
                 <w:rFonts w:ascii="Arial" w:hAnsi="Arial" w:cs="Arial"/>
@@ -1908,7 +1779,6 @@
               </w:rPr>
               <w:t>StudentProfile</w:t>
             </w:r>
-            <w:proofErr w:type="spellEnd"/>
           </w:p>
         </w:tc>
       </w:tr>
@@ -1955,7 +1825,6 @@
                 <w:szCs w:val="22"/>
               </w:rPr>
             </w:pPr>
-            <w:proofErr w:type="spellStart"/>
             <w:r>
               <w:rPr>
                 <w:rFonts w:ascii="Arial" w:hAnsi="Arial" w:cs="Arial"/>
@@ -1964,7 +1833,6 @@
               </w:rPr>
               <w:t>AboutMe</w:t>
             </w:r>
-            <w:proofErr w:type="spellEnd"/>
           </w:p>
         </w:tc>
         <w:tc>
@@ -2045,7 +1913,6 @@
                 <w:szCs w:val="22"/>
               </w:rPr>
             </w:pPr>
-            <w:proofErr w:type="spellStart"/>
             <w:r>
               <w:rPr>
                 <w:rFonts w:ascii="Arial" w:hAnsi="Arial" w:cs="Arial"/>
@@ -2054,7 +1921,6 @@
               </w:rPr>
               <w:t>StudentProfile</w:t>
             </w:r>
-            <w:proofErr w:type="spellEnd"/>
           </w:p>
         </w:tc>
       </w:tr>
@@ -2103,7 +1969,6 @@
                 <w:szCs w:val="22"/>
               </w:rPr>
             </w:pPr>
-            <w:proofErr w:type="spellStart"/>
             <w:r>
               <w:rPr>
                 <w:rFonts w:ascii="Arial" w:hAnsi="Arial" w:cs="Arial"/>
@@ -2112,7 +1977,6 @@
               </w:rPr>
               <w:t>CompanyProfile</w:t>
             </w:r>
-            <w:proofErr w:type="spellEnd"/>
           </w:p>
         </w:tc>
         <w:tc>
@@ -2197,54 +2061,14 @@
                 <w:szCs w:val="22"/>
               </w:rPr>
             </w:pPr>
-            <w:proofErr w:type="spellStart"/>
-            <w:proofErr w:type="gramStart"/>
-            <w:r>
-              <w:rPr>
-                <w:rFonts w:ascii="Arial" w:hAnsi="Arial" w:cs="Arial"/>
-                <w:sz w:val="22"/>
-                <w:szCs w:val="22"/>
-              </w:rPr>
-              <w:t>CompanyProfile</w:t>
-            </w:r>
-            <w:proofErr w:type="spellEnd"/>
-            <w:proofErr w:type="gramEnd"/>
-            <w:r>
-              <w:rPr>
-                <w:rFonts w:ascii="Arial" w:hAnsi="Arial" w:cs="Arial"/>
-                <w:sz w:val="22"/>
-                <w:szCs w:val="22"/>
-              </w:rPr>
-              <w:t xml:space="preserve">, </w:t>
-            </w:r>
-            <w:proofErr w:type="spellStart"/>
-            <w:r>
-              <w:rPr>
-                <w:rFonts w:ascii="Arial" w:hAnsi="Arial" w:cs="Arial"/>
-                <w:sz w:val="22"/>
-                <w:szCs w:val="22"/>
-              </w:rPr>
-              <w:t>CompanyLocation</w:t>
-            </w:r>
-            <w:proofErr w:type="spellEnd"/>
-            <w:r>
-              <w:rPr>
-                <w:rFonts w:ascii="Arial" w:hAnsi="Arial" w:cs="Arial"/>
-                <w:sz w:val="22"/>
-                <w:szCs w:val="22"/>
-              </w:rPr>
-              <w:t xml:space="preserve">, </w:t>
-            </w:r>
-            <w:proofErr w:type="spellStart"/>
-            <w:r>
-              <w:rPr>
-                <w:rFonts w:ascii="Arial" w:hAnsi="Arial" w:cs="Arial"/>
-                <w:sz w:val="22"/>
-                <w:szCs w:val="22"/>
-              </w:rPr>
-              <w:t>JobInterestForm</w:t>
-            </w:r>
-            <w:proofErr w:type="spellEnd"/>
+            <w:r>
+              <w:rPr>
+                <w:rFonts w:ascii="Arial" w:hAnsi="Arial" w:cs="Arial"/>
+                <w:sz w:val="22"/>
+                <w:szCs w:val="22"/>
+              </w:rPr>
+              <w:t>CompanyProfile, CompanyLocation, JobInterestForm</w:t>
+            </w:r>
           </w:p>
         </w:tc>
       </w:tr>
@@ -2291,7 +2115,6 @@
                 <w:szCs w:val="22"/>
               </w:rPr>
             </w:pPr>
-            <w:proofErr w:type="spellStart"/>
             <w:r>
               <w:rPr>
                 <w:rFonts w:ascii="Arial" w:hAnsi="Arial" w:cs="Arial"/>
@@ -2300,7 +2123,6 @@
               </w:rPr>
               <w:t>CompanyLocation</w:t>
             </w:r>
-            <w:proofErr w:type="spellEnd"/>
           </w:p>
         </w:tc>
         <w:tc>
@@ -2381,34 +2203,14 @@
                 <w:szCs w:val="22"/>
               </w:rPr>
             </w:pPr>
-            <w:proofErr w:type="spellStart"/>
-            <w:r>
-              <w:rPr>
-                <w:rFonts w:ascii="Arial" w:hAnsi="Arial" w:cs="Arial"/>
-                <w:sz w:val="22"/>
-                <w:szCs w:val="22"/>
-              </w:rPr>
-              <w:t>CompanyProfile</w:t>
-            </w:r>
-            <w:proofErr w:type="spellEnd"/>
-            <w:r>
-              <w:rPr>
-                <w:rFonts w:ascii="Arial" w:hAnsi="Arial" w:cs="Arial"/>
-                <w:sz w:val="22"/>
-                <w:szCs w:val="22"/>
-              </w:rPr>
-              <w:t xml:space="preserve">, </w:t>
-            </w:r>
-            <w:proofErr w:type="spellStart"/>
-            <w:r>
-              <w:rPr>
-                <w:rFonts w:ascii="Arial" w:hAnsi="Arial" w:cs="Arial"/>
-                <w:sz w:val="22"/>
-                <w:szCs w:val="22"/>
-              </w:rPr>
-              <w:t>PhysicalAddress</w:t>
-            </w:r>
-            <w:proofErr w:type="spellEnd"/>
+            <w:r>
+              <w:rPr>
+                <w:rFonts w:ascii="Arial" w:hAnsi="Arial" w:cs="Arial"/>
+                <w:sz w:val="22"/>
+                <w:szCs w:val="22"/>
+              </w:rPr>
+              <w:t>CompanyProfile, PhysicalAddress</w:t>
+            </w:r>
           </w:p>
         </w:tc>
       </w:tr>
@@ -2457,7 +2259,6 @@
                 <w:szCs w:val="22"/>
               </w:rPr>
             </w:pPr>
-            <w:proofErr w:type="spellStart"/>
             <w:r>
               <w:rPr>
                 <w:rFonts w:ascii="Arial" w:hAnsi="Arial" w:cs="Arial"/>
@@ -2466,7 +2267,6 @@
               </w:rPr>
               <w:t>PhysicalAddress</w:t>
             </w:r>
-            <w:proofErr w:type="spellEnd"/>
           </w:p>
         </w:tc>
         <w:tc>
@@ -2511,25 +2311,7 @@
                 <w:sz w:val="22"/>
                 <w:szCs w:val="22"/>
               </w:rPr>
-              <w:t xml:space="preserve">Stores the address details for </w:t>
-            </w:r>
-            <w:proofErr w:type="gramStart"/>
-            <w:r>
-              <w:rPr>
-                <w:rFonts w:ascii="Arial" w:hAnsi="Arial" w:cs="Arial"/>
-                <w:sz w:val="22"/>
-                <w:szCs w:val="22"/>
-              </w:rPr>
-              <w:t>a company</w:t>
-            </w:r>
-            <w:proofErr w:type="gramEnd"/>
-            <w:r>
-              <w:rPr>
-                <w:rFonts w:ascii="Arial" w:hAnsi="Arial" w:cs="Arial"/>
-                <w:sz w:val="22"/>
-                <w:szCs w:val="22"/>
-              </w:rPr>
-              <w:t xml:space="preserve"> location.</w:t>
+              <w:t>Stores the address details for a company location.</w:t>
             </w:r>
           </w:p>
         </w:tc>
@@ -2569,7 +2351,6 @@
                 <w:szCs w:val="22"/>
               </w:rPr>
             </w:pPr>
-            <w:proofErr w:type="spellStart"/>
             <w:r>
               <w:rPr>
                 <w:rFonts w:ascii="Arial" w:hAnsi="Arial" w:cs="Arial"/>
@@ -2578,7 +2359,6 @@
               </w:rPr>
               <w:t>CompanyLocation</w:t>
             </w:r>
-            <w:proofErr w:type="spellEnd"/>
           </w:p>
         </w:tc>
       </w:tr>
@@ -2625,7 +2405,6 @@
                 <w:szCs w:val="22"/>
               </w:rPr>
             </w:pPr>
-            <w:proofErr w:type="spellStart"/>
             <w:r>
               <w:rPr>
                 <w:rFonts w:ascii="Arial" w:hAnsi="Arial" w:cs="Arial"/>
@@ -2634,7 +2413,6 @@
               </w:rPr>
               <w:t>JobInterestForm</w:t>
             </w:r>
-            <w:proofErr w:type="spellEnd"/>
           </w:p>
         </w:tc>
         <w:tc>
@@ -2715,43 +2493,13 @@
                 <w:szCs w:val="22"/>
               </w:rPr>
             </w:pPr>
-            <w:proofErr w:type="spellStart"/>
-            <w:proofErr w:type="gramStart"/>
-            <w:r>
-              <w:rPr>
-                <w:rFonts w:ascii="Arial" w:hAnsi="Arial" w:cs="Arial"/>
-                <w:sz w:val="22"/>
-                <w:szCs w:val="22"/>
-              </w:rPr>
-              <w:t>CompanyProfile</w:t>
-            </w:r>
-            <w:proofErr w:type="spellEnd"/>
-            <w:proofErr w:type="gramEnd"/>
-            <w:r>
-              <w:rPr>
-                <w:rFonts w:ascii="Arial" w:hAnsi="Arial" w:cs="Arial"/>
-                <w:sz w:val="22"/>
-                <w:szCs w:val="22"/>
-              </w:rPr>
-              <w:t xml:space="preserve">, </w:t>
-            </w:r>
-            <w:proofErr w:type="spellStart"/>
-            <w:r>
-              <w:rPr>
-                <w:rFonts w:ascii="Arial" w:hAnsi="Arial" w:cs="Arial"/>
-                <w:sz w:val="22"/>
-                <w:szCs w:val="22"/>
-              </w:rPr>
-              <w:t>StudentUser</w:t>
-            </w:r>
-            <w:proofErr w:type="spellEnd"/>
-            <w:r>
-              <w:rPr>
-                <w:rFonts w:ascii="Arial" w:hAnsi="Arial" w:cs="Arial"/>
-                <w:sz w:val="22"/>
-                <w:szCs w:val="22"/>
-              </w:rPr>
-              <w:t>, Qualification</w:t>
+            <w:r>
+              <w:rPr>
+                <w:rFonts w:ascii="Arial" w:hAnsi="Arial" w:cs="Arial"/>
+                <w:sz w:val="22"/>
+                <w:szCs w:val="22"/>
+              </w:rPr>
+              <w:t>CompanyProfile, StudentUser, Qualification</w:t>
             </w:r>
           </w:p>
         </w:tc>
@@ -2893,34 +2641,14 @@
                 <w:szCs w:val="22"/>
               </w:rPr>
             </w:pPr>
-            <w:proofErr w:type="spellStart"/>
-            <w:r>
-              <w:rPr>
-                <w:rFonts w:ascii="Arial" w:hAnsi="Arial" w:cs="Arial"/>
-                <w:sz w:val="22"/>
-                <w:szCs w:val="22"/>
-              </w:rPr>
-              <w:t>JobInterestForm</w:t>
-            </w:r>
-            <w:proofErr w:type="spellEnd"/>
-            <w:r>
-              <w:rPr>
-                <w:rFonts w:ascii="Arial" w:hAnsi="Arial" w:cs="Arial"/>
-                <w:sz w:val="22"/>
-                <w:szCs w:val="22"/>
-              </w:rPr>
-              <w:t xml:space="preserve">, </w:t>
-            </w:r>
-            <w:proofErr w:type="spellStart"/>
-            <w:r>
-              <w:rPr>
-                <w:rFonts w:ascii="Arial" w:hAnsi="Arial" w:cs="Arial"/>
-                <w:sz w:val="22"/>
-                <w:szCs w:val="22"/>
-              </w:rPr>
-              <w:t>StudentUser</w:t>
-            </w:r>
-            <w:proofErr w:type="spellEnd"/>
+            <w:r>
+              <w:rPr>
+                <w:rFonts w:ascii="Arial" w:hAnsi="Arial" w:cs="Arial"/>
+                <w:sz w:val="22"/>
+                <w:szCs w:val="22"/>
+              </w:rPr>
+              <w:t>JobInterestForm, StudentUser</w:t>
+            </w:r>
           </w:p>
         </w:tc>
       </w:tr>
@@ -2970,7 +2698,6 @@
                 <w:szCs w:val="22"/>
               </w:rPr>
             </w:pPr>
-            <w:proofErr w:type="spellStart"/>
             <w:r>
               <w:rPr>
                 <w:rFonts w:ascii="Arial" w:hAnsi="Arial" w:cs="Arial"/>
@@ -2979,7 +2706,6 @@
               </w:rPr>
               <w:t>StudentFollow</w:t>
             </w:r>
-            <w:proofErr w:type="spellEnd"/>
           </w:p>
         </w:tc>
         <w:tc>
@@ -3064,34 +2790,14 @@
                 <w:szCs w:val="22"/>
               </w:rPr>
             </w:pPr>
-            <w:proofErr w:type="spellStart"/>
-            <w:r>
-              <w:rPr>
-                <w:rFonts w:ascii="Arial" w:hAnsi="Arial" w:cs="Arial"/>
-                <w:sz w:val="22"/>
-                <w:szCs w:val="22"/>
-              </w:rPr>
-              <w:t>CompanyRepresentative</w:t>
-            </w:r>
-            <w:proofErr w:type="spellEnd"/>
-            <w:r>
-              <w:rPr>
-                <w:rFonts w:ascii="Arial" w:hAnsi="Arial" w:cs="Arial"/>
-                <w:sz w:val="22"/>
-                <w:szCs w:val="22"/>
-              </w:rPr>
-              <w:t xml:space="preserve">, </w:t>
-            </w:r>
-            <w:proofErr w:type="spellStart"/>
-            <w:r>
-              <w:rPr>
-                <w:rFonts w:ascii="Arial" w:hAnsi="Arial" w:cs="Arial"/>
-                <w:sz w:val="22"/>
-                <w:szCs w:val="22"/>
-              </w:rPr>
-              <w:t>StudentUser</w:t>
-            </w:r>
-            <w:proofErr w:type="spellEnd"/>
+            <w:r>
+              <w:rPr>
+                <w:rFonts w:ascii="Arial" w:hAnsi="Arial" w:cs="Arial"/>
+                <w:sz w:val="22"/>
+                <w:szCs w:val="22"/>
+              </w:rPr>
+              <w:t>CompanyRepresentative, StudentUser</w:t>
+            </w:r>
           </w:p>
         </w:tc>
       </w:tr>
@@ -3226,7 +2932,6 @@
                 <w:szCs w:val="22"/>
               </w:rPr>
             </w:pPr>
-            <w:proofErr w:type="spellStart"/>
             <w:r>
               <w:rPr>
                 <w:rFonts w:ascii="Arial" w:hAnsi="Arial" w:cs="Arial"/>
@@ -3235,7 +2940,6 @@
               </w:rPr>
               <w:t>StudentProfile</w:t>
             </w:r>
-            <w:proofErr w:type="spellEnd"/>
           </w:p>
         </w:tc>
       </w:tr>
@@ -3284,7 +2988,6 @@
                 <w:szCs w:val="22"/>
               </w:rPr>
             </w:pPr>
-            <w:proofErr w:type="spellStart"/>
             <w:r>
               <w:rPr>
                 <w:rFonts w:ascii="Arial" w:hAnsi="Arial" w:cs="Arial"/>
@@ -3293,7 +2996,6 @@
               </w:rPr>
               <w:t>addProfileInformation</w:t>
             </w:r>
-            <w:proofErr w:type="spellEnd"/>
           </w:p>
         </w:tc>
         <w:tc>
@@ -3378,34 +3080,14 @@
                 <w:szCs w:val="22"/>
               </w:rPr>
             </w:pPr>
-            <w:proofErr w:type="spellStart"/>
-            <w:r>
-              <w:rPr>
-                <w:rFonts w:ascii="Arial" w:hAnsi="Arial" w:cs="Arial"/>
-                <w:sz w:val="22"/>
-                <w:szCs w:val="22"/>
-              </w:rPr>
-              <w:t>StudentProfile</w:t>
-            </w:r>
-            <w:proofErr w:type="spellEnd"/>
-            <w:r>
-              <w:rPr>
-                <w:rFonts w:ascii="Arial" w:hAnsi="Arial" w:cs="Arial"/>
-                <w:sz w:val="22"/>
-                <w:szCs w:val="22"/>
-              </w:rPr>
-              <w:t xml:space="preserve">, </w:t>
-            </w:r>
-            <w:proofErr w:type="spellStart"/>
-            <w:r>
-              <w:rPr>
-                <w:rFonts w:ascii="Arial" w:hAnsi="Arial" w:cs="Arial"/>
-                <w:sz w:val="22"/>
-                <w:szCs w:val="22"/>
-              </w:rPr>
-              <w:t>CompanyProfile</w:t>
-            </w:r>
-            <w:proofErr w:type="spellEnd"/>
+            <w:r>
+              <w:rPr>
+                <w:rFonts w:ascii="Arial" w:hAnsi="Arial" w:cs="Arial"/>
+                <w:sz w:val="22"/>
+                <w:szCs w:val="22"/>
+              </w:rPr>
+              <w:t>StudentProfile, CompanyProfile</w:t>
+            </w:r>
           </w:p>
         </w:tc>
       </w:tr>
@@ -3452,7 +3134,6 @@
                 <w:szCs w:val="22"/>
               </w:rPr>
             </w:pPr>
-            <w:proofErr w:type="spellStart"/>
             <w:r>
               <w:rPr>
                 <w:rFonts w:ascii="Arial" w:hAnsi="Arial" w:cs="Arial"/>
@@ -3461,7 +3142,6 @@
               </w:rPr>
               <w:t>updateProfileInformation</w:t>
             </w:r>
-            <w:proofErr w:type="spellEnd"/>
           </w:p>
         </w:tc>
         <w:tc>
@@ -3542,34 +3222,14 @@
                 <w:szCs w:val="22"/>
               </w:rPr>
             </w:pPr>
-            <w:proofErr w:type="spellStart"/>
-            <w:r>
-              <w:rPr>
-                <w:rFonts w:ascii="Arial" w:hAnsi="Arial" w:cs="Arial"/>
-                <w:sz w:val="22"/>
-                <w:szCs w:val="22"/>
-              </w:rPr>
-              <w:t>StudentProfile</w:t>
-            </w:r>
-            <w:proofErr w:type="spellEnd"/>
-            <w:r>
-              <w:rPr>
-                <w:rFonts w:ascii="Arial" w:hAnsi="Arial" w:cs="Arial"/>
-                <w:sz w:val="22"/>
-                <w:szCs w:val="22"/>
-              </w:rPr>
-              <w:t xml:space="preserve">, </w:t>
-            </w:r>
-            <w:proofErr w:type="spellStart"/>
-            <w:r>
-              <w:rPr>
-                <w:rFonts w:ascii="Arial" w:hAnsi="Arial" w:cs="Arial"/>
-                <w:sz w:val="22"/>
-                <w:szCs w:val="22"/>
-              </w:rPr>
-              <w:t>CompanyProfile</w:t>
-            </w:r>
-            <w:proofErr w:type="spellEnd"/>
+            <w:r>
+              <w:rPr>
+                <w:rFonts w:ascii="Arial" w:hAnsi="Arial" w:cs="Arial"/>
+                <w:sz w:val="22"/>
+                <w:szCs w:val="22"/>
+              </w:rPr>
+              <w:t>StudentProfile, CompanyProfile</w:t>
+            </w:r>
           </w:p>
         </w:tc>
       </w:tr>
@@ -3618,7 +3278,6 @@
                 <w:szCs w:val="22"/>
               </w:rPr>
             </w:pPr>
-            <w:proofErr w:type="spellStart"/>
             <w:r>
               <w:rPr>
                 <w:rFonts w:ascii="Arial" w:hAnsi="Arial" w:cs="Arial"/>
@@ -3627,7 +3286,6 @@
               </w:rPr>
               <w:t>deleteProfileInformation</w:t>
             </w:r>
-            <w:proofErr w:type="spellEnd"/>
           </w:p>
         </w:tc>
         <w:tc>
@@ -3712,36 +3370,23 @@
                 <w:szCs w:val="22"/>
               </w:rPr>
             </w:pPr>
-            <w:proofErr w:type="spellStart"/>
-            <w:proofErr w:type="gramStart"/>
-            <w:r>
-              <w:rPr>
-                <w:rFonts w:ascii="Arial" w:hAnsi="Arial" w:cs="Arial"/>
-                <w:sz w:val="22"/>
-                <w:szCs w:val="22"/>
-              </w:rPr>
-              <w:t>StudentProfile</w:t>
-            </w:r>
-            <w:proofErr w:type="spellEnd"/>
-            <w:proofErr w:type="gramEnd"/>
-            <w:r>
-              <w:rPr>
-                <w:rFonts w:ascii="Arial" w:hAnsi="Arial" w:cs="Arial"/>
-                <w:sz w:val="22"/>
-                <w:szCs w:val="22"/>
-              </w:rPr>
-              <w:t>,</w:t>
-            </w:r>
-          </w:p>
-          <w:p>
-            <w:pPr>
-              <w:rPr>
-                <w:rFonts w:ascii="Arial" w:hAnsi="Arial" w:cs="Arial"/>
-                <w:sz w:val="22"/>
-                <w:szCs w:val="22"/>
-              </w:rPr>
-            </w:pPr>
-            <w:proofErr w:type="spellStart"/>
+            <w:r>
+              <w:rPr>
+                <w:rFonts w:ascii="Arial" w:hAnsi="Arial" w:cs="Arial"/>
+                <w:sz w:val="22"/>
+                <w:szCs w:val="22"/>
+              </w:rPr>
+              <w:t>StudentProfile,</w:t>
+            </w:r>
+          </w:p>
+          <w:p>
+            <w:pPr>
+              <w:rPr>
+                <w:rFonts w:ascii="Arial" w:hAnsi="Arial" w:cs="Arial"/>
+                <w:sz w:val="22"/>
+                <w:szCs w:val="22"/>
+              </w:rPr>
+            </w:pPr>
             <w:r>
               <w:rPr>
                 <w:rFonts w:ascii="Arial" w:hAnsi="Arial" w:cs="Arial"/>
@@ -3750,7 +3395,6 @@
               </w:rPr>
               <w:t>CompanyProfile</w:t>
             </w:r>
-            <w:proofErr w:type="spellEnd"/>
           </w:p>
         </w:tc>
       </w:tr>
@@ -3797,7 +3441,6 @@
                 <w:szCs w:val="22"/>
               </w:rPr>
             </w:pPr>
-            <w:proofErr w:type="spellStart"/>
             <w:r>
               <w:rPr>
                 <w:rFonts w:ascii="Arial" w:hAnsi="Arial" w:cs="Arial"/>
@@ -3806,7 +3449,6 @@
               </w:rPr>
               <w:t>addCompanyLocation</w:t>
             </w:r>
-            <w:proofErr w:type="spellEnd"/>
           </w:p>
         </w:tc>
         <w:tc>
@@ -3887,7 +3529,6 @@
                 <w:szCs w:val="22"/>
               </w:rPr>
             </w:pPr>
-            <w:proofErr w:type="spellStart"/>
             <w:r>
               <w:rPr>
                 <w:rFonts w:ascii="Arial" w:hAnsi="Arial" w:cs="Arial"/>
@@ -3896,7 +3537,6 @@
               </w:rPr>
               <w:t>CompanyProfile</w:t>
             </w:r>
-            <w:proofErr w:type="spellEnd"/>
           </w:p>
         </w:tc>
       </w:tr>
@@ -3945,7 +3585,6 @@
                 <w:szCs w:val="22"/>
               </w:rPr>
             </w:pPr>
-            <w:proofErr w:type="spellStart"/>
             <w:r>
               <w:rPr>
                 <w:rFonts w:ascii="Arial" w:hAnsi="Arial" w:cs="Arial"/>
@@ -3954,7 +3593,6 @@
               </w:rPr>
               <w:t>updateCompanyLocation</w:t>
             </w:r>
-            <w:proofErr w:type="spellEnd"/>
           </w:p>
         </w:tc>
         <w:tc>
@@ -4039,7 +3677,6 @@
                 <w:szCs w:val="22"/>
               </w:rPr>
             </w:pPr>
-            <w:proofErr w:type="spellStart"/>
             <w:r>
               <w:rPr>
                 <w:rFonts w:ascii="Arial" w:hAnsi="Arial" w:cs="Arial"/>
@@ -4048,7 +3685,6 @@
               </w:rPr>
               <w:t>CompanyProfile</w:t>
             </w:r>
-            <w:proofErr w:type="spellEnd"/>
           </w:p>
         </w:tc>
       </w:tr>
@@ -4095,7 +3731,6 @@
                 <w:szCs w:val="22"/>
               </w:rPr>
             </w:pPr>
-            <w:proofErr w:type="spellStart"/>
             <w:r>
               <w:rPr>
                 <w:rFonts w:ascii="Arial" w:hAnsi="Arial" w:cs="Arial"/>
@@ -4104,7 +3739,6 @@
               </w:rPr>
               <w:t>deleteCompanyLocation</w:t>
             </w:r>
-            <w:proofErr w:type="spellEnd"/>
           </w:p>
         </w:tc>
         <w:tc>
@@ -4185,7 +3819,6 @@
                 <w:szCs w:val="22"/>
               </w:rPr>
             </w:pPr>
-            <w:proofErr w:type="spellStart"/>
             <w:r>
               <w:rPr>
                 <w:rFonts w:ascii="Arial" w:hAnsi="Arial" w:cs="Arial"/>
@@ -4194,7 +3827,6 @@
               </w:rPr>
               <w:t>CompanyProfile</w:t>
             </w:r>
-            <w:proofErr w:type="spellEnd"/>
           </w:p>
         </w:tc>
       </w:tr>

</xml_diff>